<commit_message>
Refer to attached contracts without workspace paths
</commit_message>
<xml_diff>
--- a/outputs/ARES-DACH-Ingestion-Specification.docx
+++ b/outputs/ARES-DACH-Ingestion-Specification.docx
@@ -4469,7 +4469,7 @@
         <w:pStyle w:val="Heading2"/>
       </w:pPr>
       <w:r>
-        <w:t>10.1 Delivered contracts</w:t>
+        <w:t>10.1 Attached contracts</w:t>
       </w:r>
       <w:bookmarkEnd w:id="26"/>
     </w:p>
@@ -4517,7 +4517,7 @@
                 <w:color w:val="FFFFFF"/>
                 <w:sz w:val="18"/>
               </w:rPr>
-              <w:t>Artifact</w:t>
+              <w:t>Attachment</w:t>
             </w:r>
           </w:p>
         </w:tc>
@@ -4577,7 +4577,7 @@
                 <w:color w:val="183047"/>
                 <w:sz w:val="16"/>
               </w:rPr>
-              <w:t>schemas/content-loader.schema.json</w:t>
+              <w:t>content-loader.schema.json</w:t>
             </w:r>
             <w:r>
               <w:rPr>
@@ -4640,7 +4640,7 @@
                 <w:color w:val="183047"/>
                 <w:sz w:val="16"/>
               </w:rPr>
-              <w:t>schemas/counters-loader.schema.json</w:t>
+              <w:t>counters-loader.schema.json</w:t>
             </w:r>
             <w:r>
               <w:rPr>
@@ -4703,7 +4703,7 @@
                 <w:color w:val="183047"/>
                 <w:sz w:val="16"/>
               </w:rPr>
-              <w:t>opensearch/dach-content.mapping.json</w:t>
+              <w:t>dach-content.mapping.json</w:t>
             </w:r>
             <w:r>
               <w:rPr>
@@ -4766,7 +4766,7 @@
                 <w:color w:val="183047"/>
                 <w:sz w:val="16"/>
               </w:rPr>
-              <w:t>contracts/content-output-contract.json</w:t>
+              <w:t>content-output-contract.json</w:t>
             </w:r>
             <w:r>
               <w:rPr>
@@ -4829,7 +4829,7 @@
                 <w:color w:val="183047"/>
                 <w:sz w:val="16"/>
               </w:rPr>
-              <w:t>contracts/loader-profiles.json</w:t>
+              <w:t>loader-profiles.json</w:t>
             </w:r>
             <w:r>
               <w:rPr>
@@ -4892,7 +4892,7 @@
                 <w:color w:val="183047"/>
                 <w:sz w:val="16"/>
               </w:rPr>
-              <w:t>contracts/contract-roster.json</w:t>
+              <w:t>contract-roster.json</w:t>
             </w:r>
             <w:r>
               <w:rPr>
@@ -4938,18 +4938,7 @@
     </w:p>
     <w:p>
       <w:r>
-        <w:t xml:space="preserve">Paths are relative to </w:t>
-      </w:r>
-      <w:r>
-        <w:rPr>
-          <w:rFonts w:ascii="Liberation Mono" w:hAnsi="Liberation Mono"/>
-          <w:color w:val="183047"/>
-          <w:sz w:val="17"/>
-        </w:rPr>
-        <w:t>outputs/</w:t>
-      </w:r>
-      <w:r>
-        <w:t xml:space="preserve">. The two input schemas validate the JSON object inside </w:t>
+        <w:t xml:space="preserve">The files listed above are supplied as attachments. The two input schemas validate the JSON object inside </w:t>
       </w:r>
       <w:r>
         <w:rPr>
@@ -5076,7 +5065,7 @@
         <w:t>68 mapped fields</w:t>
       </w:r>
       <w:r>
-        <w:t xml:space="preserve"> are listed below: 32 content/shared fields and 36 counters. JSON types describe the indexed output. The full nested input vocabulary is defined by </w:t>
+        <w:t xml:space="preserve"> are listed below: 32 content/shared fields and 36 counters. JSON types describe the indexed output. The full nested input vocabulary is defined by the attached </w:t>
       </w:r>
       <w:r>
         <w:rPr>
@@ -5084,7 +5073,7 @@
           <w:color w:val="183047"/>
           <w:sz w:val="17"/>
         </w:rPr>
-        <w:t>schemas/content-loader.schema.json</w:t>
+        <w:t>content-loader.schema.json</w:t>
       </w:r>
       <w:r>
         <w:t xml:space="preserve"> (§10.1).</w:t>

</xml_diff>